<commit_message>
add: correcion 2 y nuevos objetivos
</commit_message>
<xml_diff>
--- a/propuestaEnriqueSanchez.docx
+++ b/propuestaEnriqueSanchez.docx
@@ -2283,13 +2283,25 @@
         <w:rPr>
           <w:rFonts w:ascii="Times New Roman" w:eastAsia="Times New Roman" w:hAnsi="Times New Roman" w:cs="Times New Roman"/>
         </w:rPr>
+        <w:t xml:space="preserve"> </w:t>
+      </w:r>
+      <w:r>
+        <w:rPr>
+          <w:rFonts w:ascii="Times New Roman" w:eastAsia="Times New Roman" w:hAnsi="Times New Roman" w:cs="Times New Roman"/>
+        </w:rPr>
+        <w:t>[1]</w:t>
+      </w:r>
+      <w:r>
+        <w:rPr>
+          <w:rFonts w:ascii="Times New Roman" w:eastAsia="Times New Roman" w:hAnsi="Times New Roman" w:cs="Times New Roman"/>
+        </w:rPr>
         <w:t>.</w:t>
       </w:r>
       <w:r>
         <w:rPr>
           <w:rFonts w:ascii="Times New Roman" w:eastAsia="Times New Roman" w:hAnsi="Times New Roman" w:cs="Times New Roman"/>
         </w:rPr>
-        <w:t xml:space="preserve"> [1]</w:t>
+        <w:t xml:space="preserve"> </w:t>
       </w:r>
     </w:p>
     <w:p>
@@ -2379,7 +2391,19 @@
         <w:rPr>
           <w:rFonts w:ascii="Times New Roman" w:eastAsia="Times New Roman" w:hAnsi="Times New Roman" w:cs="Times New Roman"/>
         </w:rPr>
-        <w:t>. [2]</w:t>
+        <w:t xml:space="preserve"> </w:t>
+      </w:r>
+      <w:r>
+        <w:rPr>
+          <w:rFonts w:ascii="Times New Roman" w:eastAsia="Times New Roman" w:hAnsi="Times New Roman" w:cs="Times New Roman"/>
+        </w:rPr>
+        <w:t>[2]</w:t>
+      </w:r>
+      <w:r>
+        <w:rPr>
+          <w:rFonts w:ascii="Times New Roman" w:eastAsia="Times New Roman" w:hAnsi="Times New Roman" w:cs="Times New Roman"/>
+        </w:rPr>
+        <w:t xml:space="preserve">. </w:t>
       </w:r>
     </w:p>
     <w:p>
@@ -2554,7 +2578,21 @@
         <w:rPr>
           <w:rFonts w:ascii="Times New Roman" w:eastAsia="Times New Roman" w:hAnsi="Times New Roman" w:cs="Times New Roman"/>
         </w:rPr>
-        <w:t>Proponer un proceso integrado de aseguramiento de calidad (QA) en un entorno DevOps, enfocado en la automatización de pruebas dentro del pipeline CI/CD, para optimizar la calidad del software y garantizar la detección temprana de defectos</w:t>
+        <w:t xml:space="preserve">Proponer un proceso integrado de aseguramiento de calidad (QA) en un entorno DevOps, enfocado en la automatización de pruebas dentro del </w:t>
+      </w:r>
+      <w:r>
+        <w:rPr>
+          <w:rFonts w:ascii="Times New Roman" w:eastAsia="Times New Roman" w:hAnsi="Times New Roman" w:cs="Times New Roman"/>
+          <w:i/>
+          <w:iCs/>
+        </w:rPr>
+        <w:t>pipeline</w:t>
+      </w:r>
+      <w:r>
+        <w:rPr>
+          <w:rFonts w:ascii="Times New Roman" w:eastAsia="Times New Roman" w:hAnsi="Times New Roman" w:cs="Times New Roman"/>
+        </w:rPr>
+        <w:t xml:space="preserve"> CI/CD, para optimizar la calidad del software y garantizar la detección temprana de defectos</w:t>
       </w:r>
       <w:r>
         <w:rPr>
@@ -2651,13 +2689,34 @@
         <w:jc w:val="left"/>
         <w:rPr>
           <w:rFonts w:ascii="Times New Roman" w:eastAsia="Times New Roman" w:hAnsi="Times New Roman" w:cs="Times New Roman"/>
-        </w:rPr>
-      </w:pPr>
-      <w:r>
-        <w:rPr>
-          <w:rFonts w:ascii="Times New Roman" w:eastAsia="Times New Roman" w:hAnsi="Times New Roman" w:cs="Times New Roman"/>
-        </w:rPr>
-        <w:t>Identificar las mejores prácticas y herramientas para la automatización de pruebas y la medición de calidad en DevOps, basándose en una revisión bibliográfica exhaustiva.</w:t>
+          <w:lang w:val="en-US"/>
+        </w:rPr>
+      </w:pPr>
+      <w:r>
+        <w:rPr>
+          <w:rFonts w:ascii="Times New Roman" w:eastAsia="Times New Roman" w:hAnsi="Times New Roman" w:cs="Times New Roman"/>
+        </w:rPr>
+        <w:t>Realizar un análisis del estado del arte sobre la</w:t>
+      </w:r>
+      <w:r>
+        <w:rPr>
+          <w:rFonts w:ascii="Times New Roman" w:eastAsia="Times New Roman" w:hAnsi="Times New Roman" w:cs="Times New Roman"/>
+        </w:rPr>
+        <w:t xml:space="preserve">s prácticas de automatización de pruebas, medición de calidad y aseguramiento de calidad continua en entornos DevOps y </w:t>
+      </w:r>
+      <w:r>
+        <w:rPr>
+          <w:rFonts w:ascii="Times New Roman" w:eastAsia="Times New Roman" w:hAnsi="Times New Roman" w:cs="Times New Roman"/>
+          <w:i/>
+          <w:iCs/>
+        </w:rPr>
+        <w:t xml:space="preserve">pipelines </w:t>
+      </w:r>
+      <w:r>
+        <w:rPr>
+          <w:rFonts w:ascii="Times New Roman" w:eastAsia="Times New Roman" w:hAnsi="Times New Roman" w:cs="Times New Roman"/>
+        </w:rPr>
+        <w:t>CI/CD.</w:t>
       </w:r>
     </w:p>
     <w:p>
@@ -2691,6 +2750,7 @@
         <w:pStyle w:val="ListParagraph"/>
         <w:rPr>
           <w:rFonts w:ascii="Times New Roman" w:eastAsia="Times New Roman" w:hAnsi="Times New Roman" w:cs="Times New Roman"/>
+          <w:lang w:val="en-US"/>
         </w:rPr>
       </w:pPr>
       <w:r>
@@ -2742,7 +2802,27 @@
         <w:rPr>
           <w:rFonts w:ascii="Times New Roman" w:eastAsia="Times New Roman" w:hAnsi="Times New Roman" w:cs="Times New Roman"/>
         </w:rPr>
-        <w:t>Implementar herramientas de análisis estático de código (SAST) para la detección automatizada y temprana de vulnerabilidades.</w:t>
+        <w:t>Diseñar</w:t>
+      </w:r>
+      <w:r>
+        <w:rPr>
+          <w:rFonts w:ascii="Times New Roman" w:eastAsia="Times New Roman" w:hAnsi="Times New Roman" w:cs="Times New Roman"/>
+        </w:rPr>
+        <w:t xml:space="preserve"> un marco de trabajo para la integración de prácticas de aseguramiento de calidad en entornos DevOps y </w:t>
+      </w:r>
+      <w:r>
+        <w:rPr>
+          <w:rFonts w:ascii="Times New Roman" w:eastAsia="Times New Roman" w:hAnsi="Times New Roman" w:cs="Times New Roman"/>
+          <w:i/>
+          <w:iCs/>
+        </w:rPr>
+        <w:t xml:space="preserve">pipelines </w:t>
+      </w:r>
+      <w:r>
+        <w:rPr>
+          <w:rFonts w:ascii="Times New Roman" w:eastAsia="Times New Roman" w:hAnsi="Times New Roman" w:cs="Times New Roman"/>
+        </w:rPr>
+        <w:t>CI/CD, incorporando herramientas de automatización, análisis estático y medición de calidad.</w:t>
       </w:r>
     </w:p>
     <w:p>
@@ -2786,7 +2866,13 @@
         <w:rPr>
           <w:rFonts w:ascii="Times New Roman" w:eastAsia="Times New Roman" w:hAnsi="Times New Roman" w:cs="Times New Roman"/>
         </w:rPr>
-        <w:t>Diseñar y desarrollar un conjunto de pruebas automatizadas que cubran la funcionalidad crítica del sistema.</w:t>
+        <w:t>I</w:t>
+      </w:r>
+      <w:r>
+        <w:rPr>
+          <w:rFonts w:ascii="Times New Roman" w:eastAsia="Times New Roman" w:hAnsi="Times New Roman" w:cs="Times New Roman"/>
+        </w:rPr>
+        <w:t>mplementar el marco de trabajo propuesto mediante la integración de herramientas de automatización de pruebas, análisis de calidad y métricas dentro de un pipeline CI/CD.</w:t>
       </w:r>
     </w:p>
     <w:p>
@@ -2799,21 +2885,16 @@
         <w:rPr>
           <w:rFonts w:ascii="Times New Roman" w:eastAsia="Times New Roman" w:hAnsi="Times New Roman" w:cs="Times New Roman"/>
           <w:b/>
+          <w:bCs/>
         </w:rPr>
       </w:pPr>
       <w:r>
         <w:rPr>
           <w:rFonts w:ascii="Times New Roman" w:eastAsia="Times New Roman" w:hAnsi="Times New Roman" w:cs="Times New Roman"/>
           <w:b/>
-        </w:rPr>
-        <w:t xml:space="preserve">OBJETIVO </w:t>
-      </w:r>
-      <w:r>
-        <w:rPr>
-          <w:rFonts w:ascii="Times New Roman" w:eastAsia="Times New Roman" w:hAnsi="Times New Roman" w:cs="Times New Roman"/>
-          <w:b/>
-        </w:rPr>
-        <w:t>5</w:t>
+          <w:bCs/>
+        </w:rPr>
+        <w:t>OBJETIVO 7</w:t>
       </w:r>
     </w:p>
     <w:p>
@@ -2831,91 +2912,13 @@
         <w:rPr>
           <w:rFonts w:ascii="Times New Roman" w:eastAsia="Times New Roman" w:hAnsi="Times New Roman" w:cs="Times New Roman"/>
         </w:rPr>
-        <w:t>Integrar pruebas automáticas en el pipeline CI/CD, asegurando su ejecución continua con cada cambio introducido en el código.</w:t>
-      </w:r>
-    </w:p>
-    <w:p>
-      <w:pPr>
-        <w:numPr>
-          <w:ilvl w:val="0"/>
-          <w:numId w:val="3"/>
-        </w:numPr>
-        <w:ind w:left="1440"/>
-        <w:rPr>
-          <w:rFonts w:ascii="Times New Roman" w:eastAsia="Times New Roman" w:hAnsi="Times New Roman" w:cs="Times New Roman"/>
-          <w:b/>
-        </w:rPr>
-      </w:pPr>
-      <w:r>
-        <w:rPr>
-          <w:rFonts w:ascii="Times New Roman" w:eastAsia="Times New Roman" w:hAnsi="Times New Roman" w:cs="Times New Roman"/>
-          <w:b/>
-        </w:rPr>
-        <w:t>OBJETIVO 6</w:t>
-      </w:r>
-    </w:p>
-    <w:p>
-      <w:pPr>
-        <w:pStyle w:val="ListParagraph"/>
-        <w:widowControl w:val="0"/>
-        <w:spacing w:before="43"/>
-        <w:ind w:right="684"/>
-        <w:jc w:val="left"/>
-        <w:rPr>
-          <w:rFonts w:ascii="Times New Roman" w:eastAsia="Times New Roman" w:hAnsi="Times New Roman" w:cs="Times New Roman"/>
-        </w:rPr>
-      </w:pPr>
-      <w:r>
-        <w:rPr>
-          <w:rFonts w:ascii="Times New Roman" w:eastAsia="Times New Roman" w:hAnsi="Times New Roman" w:cs="Times New Roman"/>
-        </w:rPr>
-        <w:t>Definir e implementar métricas que permitan medir la eficiencia del proceso de QA y la estabilidad del producto.</w:t>
-      </w:r>
-    </w:p>
-    <w:p>
-      <w:pPr>
-        <w:numPr>
-          <w:ilvl w:val="0"/>
-          <w:numId w:val="3"/>
-        </w:numPr>
-        <w:ind w:left="1440"/>
-        <w:rPr>
-          <w:rFonts w:ascii="Times New Roman" w:eastAsia="Times New Roman" w:hAnsi="Times New Roman" w:cs="Times New Roman"/>
-          <w:b/>
-          <w:bCs/>
-        </w:rPr>
-      </w:pPr>
-      <w:r>
-        <w:rPr>
-          <w:rFonts w:ascii="Times New Roman" w:eastAsia="Times New Roman" w:hAnsi="Times New Roman" w:cs="Times New Roman"/>
-          <w:b/>
-          <w:bCs/>
-        </w:rPr>
-        <w:t>OBJETIVO 7</w:t>
-      </w:r>
-    </w:p>
-    <w:p>
-      <w:pPr>
-        <w:pStyle w:val="ListParagraph"/>
-        <w:widowControl w:val="0"/>
-        <w:spacing w:before="43"/>
-        <w:ind w:right="684"/>
-        <w:jc w:val="left"/>
-        <w:rPr>
-          <w:rFonts w:ascii="Times New Roman" w:eastAsia="Times New Roman" w:hAnsi="Times New Roman" w:cs="Times New Roman"/>
-        </w:rPr>
-      </w:pPr>
-      <w:r>
-        <w:rPr>
-          <w:rFonts w:ascii="Times New Roman" w:eastAsia="Times New Roman" w:hAnsi="Times New Roman" w:cs="Times New Roman"/>
-        </w:rPr>
-        <w:t>Evaluar</w:t>
-      </w:r>
-      <w:r>
-        <w:rPr>
-          <w:rFonts w:ascii="Times New Roman" w:eastAsia="Times New Roman" w:hAnsi="Times New Roman" w:cs="Times New Roman"/>
-        </w:rPr>
-        <w:t xml:space="preserve"> los resultados obtenidos para identificar cuellos de botella, áreas de riesgo y oportunidades de mejora continua en el flujo de trabajo.</w:t>
+        <w:t>E</w:t>
+      </w:r>
+      <w:r>
+        <w:rPr>
+          <w:rFonts w:ascii="Times New Roman" w:eastAsia="Times New Roman" w:hAnsi="Times New Roman" w:cs="Times New Roman"/>
+        </w:rPr>
+        <w:t>valuar la efectividad del marco de trabajo mediante el análisis de indicadores de calidad, eficiencia del proceso de QA y estabilidad del producto.</w:t>
       </w:r>
     </w:p>
     <w:p>
@@ -2975,7 +2978,6 @@
           <w:b/>
           <w:color w:val="000000"/>
         </w:rPr>
-        <w:lastRenderedPageBreak/>
         <w:t>FORMULACIÓN GENERAL DEL PROYECTO</w:t>
       </w:r>
     </w:p>
@@ -3115,13 +3117,21 @@
           <w:rFonts w:ascii="Times New Roman" w:eastAsia="Times New Roman" w:hAnsi="Times New Roman" w:cs="Times New Roman"/>
           <w:color w:val="000000"/>
         </w:rPr>
-        <w:t xml:space="preserve">donde el tiempo es dinero, y el éxito de un producto puede verse afectada por la reputación que las personas tienen sobre este. Es por eso </w:t>
+        <w:t xml:space="preserve">donde el tiempo es dinero, y el éxito de un </w:t>
       </w:r>
       <w:r>
         <w:rPr>
           <w:rFonts w:ascii="Times New Roman" w:eastAsia="Times New Roman" w:hAnsi="Times New Roman" w:cs="Times New Roman"/>
           <w:color w:val="000000"/>
         </w:rPr>
+        <w:lastRenderedPageBreak/>
+        <w:t xml:space="preserve">producto puede verse afectada por la reputación que las personas tienen sobre este. Es por eso </w:t>
+      </w:r>
+      <w:r>
+        <w:rPr>
+          <w:rFonts w:ascii="Times New Roman" w:eastAsia="Times New Roman" w:hAnsi="Times New Roman" w:cs="Times New Roman"/>
+          <w:color w:val="000000"/>
+        </w:rPr>
         <w:t>por lo que</w:t>
       </w:r>
       <w:r>
@@ -3164,14 +3174,35 @@
           <w:rFonts w:ascii="Times New Roman" w:eastAsia="Times New Roman" w:hAnsi="Times New Roman" w:cs="Times New Roman"/>
           <w:color w:val="000000"/>
         </w:rPr>
-        <w:t xml:space="preserve">reputación. </w:t>
+        <w:t>reputación</w:t>
       </w:r>
       <w:r>
         <w:rPr>
           <w:rFonts w:ascii="Times New Roman" w:eastAsia="Times New Roman" w:hAnsi="Times New Roman" w:cs="Times New Roman"/>
           <w:color w:val="000000"/>
         </w:rPr>
-        <w:t xml:space="preserve"> [3]</w:t>
+        <w:t xml:space="preserve"> </w:t>
+      </w:r>
+      <w:r>
+        <w:rPr>
+          <w:rFonts w:ascii="Times New Roman" w:eastAsia="Times New Roman" w:hAnsi="Times New Roman" w:cs="Times New Roman"/>
+          <w:color w:val="000000"/>
+        </w:rPr>
+        <w:t>[3]</w:t>
+      </w:r>
+      <w:r>
+        <w:rPr>
+          <w:rFonts w:ascii="Times New Roman" w:eastAsia="Times New Roman" w:hAnsi="Times New Roman" w:cs="Times New Roman"/>
+          <w:color w:val="000000"/>
+        </w:rPr>
+        <w:t xml:space="preserve">. </w:t>
+      </w:r>
+      <w:r>
+        <w:rPr>
+          <w:rFonts w:ascii="Times New Roman" w:eastAsia="Times New Roman" w:hAnsi="Times New Roman" w:cs="Times New Roman"/>
+          <w:color w:val="000000"/>
+        </w:rPr>
+        <w:t xml:space="preserve"> </w:t>
       </w:r>
     </w:p>
     <w:p>
@@ -3940,7 +3971,6 @@
           <w:rFonts w:ascii="Times New Roman" w:eastAsia="Times New Roman" w:hAnsi="Times New Roman" w:cs="Times New Roman"/>
           <w:lang w:val="es-419"/>
         </w:rPr>
-        <w:lastRenderedPageBreak/>
         <w:t>La automatización rigurosa de pruebas fue identificada como un factor principal para la entrega continua, particularmente para negocios online que despliegan cambios hasta varias veces por día</w:t>
       </w:r>
       <w:r>
@@ -4036,6 +4066,7 @@
           <w:rFonts w:ascii="Times New Roman" w:eastAsia="Times New Roman" w:hAnsi="Times New Roman" w:cs="Times New Roman"/>
           <w:lang w:val="es-419"/>
         </w:rPr>
+        <w:lastRenderedPageBreak/>
         <w:t>Pirámide de Pruebas</w:t>
       </w:r>
       <w:r>
@@ -4953,7 +4984,6 @@
           <w:b/>
           <w:color w:val="000000"/>
         </w:rPr>
-        <w:lastRenderedPageBreak/>
         <w:t>RESULTADOS ESPERADOS DEL PROYECTO</w:t>
       </w:r>
     </w:p>
@@ -9256,6 +9286,7 @@
   <w:style w:type="character" w:default="1" w:styleId="DefaultParagraphFont">
     <w:name w:val="Default Paragraph Font"/>
     <w:uiPriority w:val="1"/>
+    <w:semiHidden/>
     <w:unhideWhenUsed/>
   </w:style>
   <w:style w:type="table" w:default="1" w:styleId="TableNormal">
@@ -9987,12 +10018,6 @@
 </file>
 
 <file path=customXml/item1.xml><?xml version="1.0" encoding="utf-8"?>
-<go:gDocsCustomXmlDataStorage xmlns:go="http://customooxmlschemas.google.com/" xmlns:r="http://schemas.openxmlformats.org/officeDocument/2006/relationships">
-  <go:docsCustomData xmlns:go="http://customooxmlschemas.google.com/" roundtripDataSignature="AMtx7mhWOFqCIjSP5ymZ4omUrDb8sxaNKA==">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</go:docsCustomData>
-</go:gDocsCustomXmlDataStorage>
-</file>
-
-<file path=customXml/item2.xml><?xml version="1.0" encoding="utf-8"?>
 <b:Sources xmlns:b="http://schemas.openxmlformats.org/officeDocument/2006/bibliography" StyleName="Chicago" SelectedStyle="\CHICAGO.XSL" Version="16">
   <b:Source>
     <b:Tag>source1</b:Tag>
@@ -10068,19 +10093,25 @@
 </b:Sources>
 </file>
 
+<file path=customXml/item2.xml><?xml version="1.0" encoding="utf-8"?>
+<go:gDocsCustomXmlDataStorage xmlns:go="http://customooxmlschemas.google.com/" xmlns:r="http://schemas.openxmlformats.org/officeDocument/2006/relationships">
+  <go:docsCustomData xmlns:go="http://customooxmlschemas.google.com/" roundtripDataSignature="AMtx7mhWOFqCIjSP5ymZ4omUrDb8sxaNKA==">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</go:docsCustomData>
+</go:gDocsCustomXmlDataStorage>
+</file>
+
 <file path=customXml/itemProps1.xml><?xml version="1.0" encoding="utf-8"?>
+<ds:datastoreItem xmlns:ds="http://schemas.openxmlformats.org/officeDocument/2006/customXml" ds:itemID="{B87A8438-573A-4030-A4C4-3542E57F64F0}">
+  <ds:schemaRefs>
+    <ds:schemaRef ds:uri="http://schemas.openxmlformats.org/officeDocument/2006/bibliography"/>
+  </ds:schemaRefs>
+</ds:datastoreItem>
+</file>
+
+<file path=customXml/itemProps2.xml><?xml version="1.0" encoding="utf-8"?>
 <ds:datastoreItem xmlns:ds="http://schemas.openxmlformats.org/officeDocument/2006/customXml" ds:itemID="{11111111-1234-1234-1234-123412341234}">
   <ds:schemaRefs>
     <ds:schemaRef ds:uri="http://customooxmlschemas.google.com/"/>
     <ds:schemaRef ds:uri="http://schemas.openxmlformats.org/officeDocument/2006/relationships"/>
   </ds:schemaRefs>
 </ds:datastoreItem>
-</file>
-
-<file path=customXml/itemProps2.xml><?xml version="1.0" encoding="utf-8"?>
-<ds:datastoreItem xmlns:ds="http://schemas.openxmlformats.org/officeDocument/2006/customXml" ds:itemID="{B87A8438-573A-4030-A4C4-3542E57F64F0}">
-  <ds:schemaRefs>
-    <ds:schemaRef ds:uri="http://schemas.openxmlformats.org/officeDocument/2006/bibliography"/>
-  </ds:schemaRefs>
-</ds:datastoreItem>
 </file>
</xml_diff>